<commit_message>
chore: translate in-code comments and user-facing messages to English
Co-Authored-By: Claude Opus 4.8 (1M context) <noreply@anthropic.com>
</commit_message>
<xml_diff>
--- a/note.docx
+++ b/note.docx
@@ -23,7 +23,7 @@
                     <pic:cNvPicPr/>
                   </pic:nvPicPr>
                   <pic:blipFill>
-                    <a:blip r:embed="rId4"/>
+                    <a:blip r:embed="rId6"/>
                     <a:stretch>
                       <a:fillRect/>
                     </a:stretch>
@@ -50,15 +50,266 @@
         <w:rPr>
           <w:rFonts w:hint="eastAsia"/>
         </w:rPr>
-        <w:t>问问老师什么时候可以收集更多数据集，目前只能用大于15张的来训练</w:t>
-      </w:r>
-    </w:p>
-    <w:p>
-      <w:r>
-        <w:rPr>
-          <w:rFonts w:hint="eastAsia"/>
-        </w:rPr>
-        <w:t>问问企鹅的更新的速度，新来的，新生的，</w:t>
+        <w:t>问问老师什么时候可以收集更多数据集，目前</w:t>
+      </w:r>
+      <w:r>
+        <w:rPr>
+          <w:rFonts w:hint="eastAsia"/>
+        </w:rPr>
+        <w:t>是用的</w:t>
+      </w:r>
+      <w:r>
+        <w:rPr>
+          <w:rFonts w:hint="eastAsia"/>
+        </w:rPr>
+        <w:t>大于15张的来训练</w:t>
+      </w:r>
+    </w:p>
+    <w:p>
+      <w:pPr>
+        <w:rPr>
+          <w:color w:val="EE0000"/>
+        </w:rPr>
+      </w:pPr>
+      <w:r>
+        <w:rPr>
+          <w:rFonts w:hint="eastAsia"/>
+        </w:rPr>
+        <w:t>问问企鹅的更新的速度，新来的，新生的</w:t>
+      </w:r>
+      <w:r>
+        <w:rPr>
+          <w:rFonts w:hint="eastAsia"/>
+          <w:color w:val="EE0000"/>
+        </w:rPr>
+        <w:t>，</w:t>
+      </w:r>
+      <w:r>
+        <w:rPr>
+          <w:rFonts w:hint="eastAsia"/>
+          <w:color w:val="EE0000"/>
+        </w:rPr>
+        <w:t>需不需要为新来的企鹅考虑</w:t>
+      </w:r>
+      <w:r>
+        <w:rPr>
+          <w:rFonts w:hint="eastAsia"/>
+          <w:color w:val="EE0000"/>
+        </w:rPr>
+        <w:t xml:space="preserve"> 需要</w:t>
+      </w:r>
+    </w:p>
+    <w:p>
+      <w:pPr>
+        <w:rPr>
+          <w:color w:val="EE0000"/>
+        </w:rPr>
+      </w:pPr>
+      <w:r>
+        <w:rPr>
+          <w:color w:val="EE0000"/>
+        </w:rPr>
+        <w:t>Should I verify it by referring to some photos that tourists could take, rather than using the clear photos taken by the keepers for verification?</w:t>
+      </w:r>
+    </w:p>
+    <w:p>
+      <w:pPr>
+        <w:rPr>
+          <w:color w:val="EE0000"/>
+        </w:rPr>
+      </w:pPr>
+      <w:r>
+        <w:rPr>
+          <w:rFonts w:hint="eastAsia"/>
+          <w:color w:val="EE0000"/>
+        </w:rPr>
+        <w:t>要不要收集游客角度的照片</w:t>
+      </w:r>
+    </w:p>
+    <w:p>
+      <w:pPr>
+        <w:rPr>
+          <w:color w:val="EE0000"/>
+        </w:rPr>
+      </w:pPr>
+    </w:p>
+    <w:p>
+      <w:pPr>
+        <w:rPr>
+          <w:color w:val="EE0000"/>
+        </w:rPr>
+      </w:pPr>
+      <w:r>
+        <w:rPr>
+          <w:rFonts w:hint="eastAsia"/>
+          <w:color w:val="EE0000"/>
+        </w:rPr>
+        <w:t>I will compare with other backbone models instead of use resnet18</w:t>
+      </w:r>
+    </w:p>
+    <w:p>
+      <w:pPr>
+        <w:rPr>
+          <w:color w:val="EE0000"/>
+        </w:rPr>
+      </w:pPr>
+      <w:r>
+        <w:rPr>
+          <w:rFonts w:hint="eastAsia"/>
+          <w:color w:val="EE0000"/>
+        </w:rPr>
+        <w:t>比较其他模型</w:t>
+      </w:r>
+    </w:p>
+    <w:p>
+      <w:pPr>
+        <w:rPr>
+          <w:color w:val="EE0000"/>
+        </w:rPr>
+      </w:pPr>
+    </w:p>
+    <w:p>
+      <w:pPr>
+        <w:rPr>
+          <w:color w:val="EE0000"/>
+        </w:rPr>
+      </w:pPr>
+      <w:r>
+        <w:rPr>
+          <w:color w:val="EE0000"/>
+        </w:rPr>
+        <w:t>My current results suggest that, for penguins with more than 15 photos, a ResNet18 classifier can achieve over 90% overall accuracy in a closed-set identification task.</w:t>
+      </w:r>
+    </w:p>
+    <w:p>
+      <w:pPr>
+        <w:rPr>
+          <w:color w:val="EE0000"/>
+        </w:rPr>
+      </w:pPr>
+      <w:r>
+        <w:rPr>
+          <w:rFonts w:hint="eastAsia"/>
+          <w:color w:val="EE0000"/>
+        </w:rPr>
+        <w:t>如果能够每只都有15张以上的照片，就可以达到90</w:t>
+      </w:r>
+    </w:p>
+    <w:p>
+      <w:pPr>
+        <w:rPr>
+          <w:color w:val="EE0000"/>
+        </w:rPr>
+      </w:pPr>
+    </w:p>
+    <w:p>
+      <w:pPr>
+        <w:rPr>
+          <w:color w:val="EE0000"/>
+        </w:rPr>
+      </w:pPr>
+    </w:p>
+    <w:p>
+      <w:pPr>
+        <w:rPr>
+          <w:color w:val="EE0000"/>
+        </w:rPr>
+      </w:pPr>
+    </w:p>
+    <w:p>
+      <w:pPr>
+        <w:rPr>
+          <w:color w:val="EE0000"/>
+        </w:rPr>
+      </w:pPr>
+      <w:r>
+        <w:rPr>
+          <w:color w:val="EE0000"/>
+        </w:rPr>
+        <w:lastRenderedPageBreak/>
+        <w:t>One thing I’m concerned about is that visitors may not always take photos where the penguin’s belly is visible. My current model may be using a lot of belly-related features, because many of the training images show the belly clearly.</w:t>
+      </w:r>
+    </w:p>
+    <w:p>
+      <w:pPr>
+        <w:rPr>
+          <w:color w:val="EE0000"/>
+        </w:rPr>
+      </w:pPr>
+      <w:proofErr w:type="gramStart"/>
+      <w:r>
+        <w:rPr>
+          <w:color w:val="EE0000"/>
+        </w:rPr>
+        <w:t>So</w:t>
+      </w:r>
+      <w:proofErr w:type="gramEnd"/>
+      <w:r>
+        <w:rPr>
+          <w:color w:val="EE0000"/>
+        </w:rPr>
+        <w:t xml:space="preserve"> I think there are two possible solutions. One is to train a model that does not mainly rely on the belly, for example by using whole-body or side-view features. The other is to give visitors some guidance when taking photos, so that they try to capture the belly </w:t>
+      </w:r>
+      <w:proofErr w:type="gramStart"/>
+      <w:r>
+        <w:rPr>
+          <w:color w:val="EE0000"/>
+        </w:rPr>
+        <w:t>area</w:t>
+      </w:r>
+      <w:proofErr w:type="gramEnd"/>
+      <w:r>
+        <w:rPr>
+          <w:color w:val="EE0000"/>
+        </w:rPr>
+        <w:t xml:space="preserve"> when possible, which should improve the recognition accuracy.</w:t>
+      </w:r>
+    </w:p>
+    <w:p>
+      <w:pPr>
+        <w:rPr>
+          <w:color w:val="EE0000"/>
+        </w:rPr>
+      </w:pPr>
+      <w:r>
+        <w:rPr>
+          <w:color w:val="EE0000"/>
+        </w:rPr>
+        <w:t xml:space="preserve">which approach </w:t>
+      </w:r>
+      <w:r>
+        <w:rPr>
+          <w:rFonts w:hint="eastAsia"/>
+          <w:color w:val="EE0000"/>
+        </w:rPr>
+        <w:t xml:space="preserve">do you think </w:t>
+      </w:r>
+      <w:r>
+        <w:rPr>
+          <w:color w:val="EE0000"/>
+        </w:rPr>
+        <w:t>makes more sense.</w:t>
+      </w:r>
+    </w:p>
+    <w:p>
+      <w:pPr>
+        <w:rPr>
+          <w:color w:val="EE0000"/>
+        </w:rPr>
+      </w:pPr>
+    </w:p>
+    <w:p>
+      <w:pPr>
+        <w:rPr>
+          <w:color w:val="EE0000"/>
+        </w:rPr>
+      </w:pPr>
+      <w:r>
+        <w:rPr>
+          <w:rFonts w:hint="eastAsia"/>
+          <w:color w:val="EE0000"/>
+        </w:rPr>
+        <w:t>后续的发展</w:t>
       </w:r>
     </w:p>
     <w:p>
@@ -106,7 +357,15 @@
     <w:p/>
     <w:p>
       <w:r>
-        <w:t xml:space="preserve">  显示图片 — 用 Pillow 加载图片，缩放到屏幕大小，转成 tkinter 能显示的格式贴到画布上。</w:t>
+        <w:t xml:space="preserve">  显示图片 — 用 Pillow 加载图片，缩放到屏幕大小，转成 </w:t>
+      </w:r>
+      <w:proofErr w:type="spellStart"/>
+      <w:r>
+        <w:t>tkinter</w:t>
+      </w:r>
+      <w:proofErr w:type="spellEnd"/>
+      <w:r>
+        <w:t xml:space="preserve"> 能显示的格式贴到画布上。</w:t>
       </w:r>
     </w:p>
     <w:p/>
@@ -138,7 +397,23 @@
     </w:p>
     <w:p>
       <w:r>
-        <w:t xml:space="preserve">  0  0.512  0.634  0.380  0.420</w:t>
+        <w:t xml:space="preserve">  </w:t>
+      </w:r>
+      <w:proofErr w:type="gramStart"/>
+      <w:r>
+        <w:t>0  0.512</w:t>
+      </w:r>
+      <w:proofErr w:type="gramEnd"/>
+      <w:r>
+        <w:t xml:space="preserve">  </w:t>
+      </w:r>
+      <w:proofErr w:type="gramStart"/>
+      <w:r>
+        <w:t>0.634  0.380</w:t>
+      </w:r>
+      <w:proofErr w:type="gramEnd"/>
+      <w:r>
+        <w:t xml:space="preserve">  0.420</w:t>
       </w:r>
     </w:p>
     <w:p>
@@ -153,6 +428,7 @@
     </w:p>
     <w:p>
       <w:r>
+        <w:lastRenderedPageBreak/>
         <w:t xml:space="preserve">  (都是0~1之间的比例值)</w:t>
       </w:r>
     </w:p>
@@ -165,7 +441,15 @@
     <w:p/>
     <w:p>
       <w:r>
-        <w:t xml:space="preserve">  整个工具大概150行代码，专门为你这个任务定制的，比 labelImg 简单很多，所以也更稳定。</w:t>
+        <w:t xml:space="preserve">  整个工具大概150行代码，专门为你这个任务定制的，比 </w:t>
+      </w:r>
+      <w:proofErr w:type="spellStart"/>
+      <w:r>
+        <w:t>labelImg</w:t>
+      </w:r>
+      <w:proofErr w:type="spellEnd"/>
+      <w:r>
+        <w:t xml:space="preserve"> 简单很多，所以也更稳定。</w:t>
       </w:r>
     </w:p>
     <w:p/>
@@ -199,7 +483,7 @@
                     <pic:cNvPicPr/>
                   </pic:nvPicPr>
                   <pic:blipFill>
-                    <a:blip r:embed="rId5"/>
+                    <a:blip r:embed="rId7"/>
                     <a:stretch>
                       <a:fillRect/>
                     </a:stretch>
@@ -240,7 +524,7 @@
                     <pic:cNvPicPr/>
                   </pic:nvPicPr>
                   <pic:blipFill>
-                    <a:blip r:embed="rId6"/>
+                    <a:blip r:embed="rId8"/>
                     <a:stretch>
                       <a:fillRect/>
                     </a:stretch>
@@ -261,6 +545,305 @@
         </w:drawing>
       </w:r>
     </w:p>
+    <w:p/>
+    <w:p>
+      <w:r>
+        <w:rPr>
+          <w:rFonts w:hint="eastAsia"/>
+        </w:rPr>
+        <w:t>计划将上述识别能力封装为一个面向游客的对话式应用。</w:t>
+      </w:r>
+      <w:proofErr w:type="gramStart"/>
+      <w:r>
+        <w:rPr>
+          <w:rFonts w:hint="eastAsia"/>
+        </w:rPr>
+        <w:t>用户扫码或</w:t>
+      </w:r>
+      <w:proofErr w:type="gramEnd"/>
+      <w:r>
+        <w:rPr>
+          <w:rFonts w:hint="eastAsia"/>
+        </w:rPr>
+        <w:t>打开应用进入界面后，系统主动问候：</w:t>
+      </w:r>
+    </w:p>
+    <w:p>
+      <w:r>
+        <w:rPr>
+          <w:rFonts w:hint="eastAsia"/>
+        </w:rPr>
+        <w:t>▎</w:t>
+      </w:r>
+      <w:r>
+        <w:t xml:space="preserve"> "我是洪堡企鹅专家。你可以拍摄企鹅的正面照片，我会告诉你它是哪一只，以及它的名字、性格、出生日期和特征；关于企鹅的任何问题也欢迎随时向我提问。"</w:t>
+      </w:r>
+    </w:p>
+    <w:p>
+      <w:r>
+        <w:rPr>
+          <w:rFonts w:hint="eastAsia"/>
+        </w:rPr>
+        <w:t>交互逻辑为：</w:t>
+      </w:r>
+    </w:p>
+    <w:p>
+      <w:r>
+        <w:t>- 当用户上传企鹅照片时，调用向量库进行匹配，识别出对应个体并介绍其信息；</w:t>
+      </w:r>
+    </w:p>
+    <w:p>
+      <w:r>
+        <w:t>- 当用户提出企鹅相关问题时，调取知识库进行检索并生成回答（RAG，检索增强生成）。</w:t>
+      </w:r>
+    </w:p>
+    <w:p/>
+    <w:p/>
+    <w:p/>
+    <w:p/>
+    <w:p/>
+    <w:p/>
+    <w:p/>
+    <w:p/>
+    <w:p>
+      <w:pPr>
+        <w:rPr>
+          <w:rFonts w:hint="eastAsia"/>
+        </w:rPr>
+      </w:pPr>
+    </w:p>
+    <w:p/>
+    <w:p>
+      <w:r>
+        <w:lastRenderedPageBreak/>
+        <w:t xml:space="preserve">I built a vector database using features extracted with ResNet-18. The current accuracy has reached </w:t>
+      </w:r>
+      <w:r>
+        <w:rPr>
+          <w:b/>
+          <w:bCs/>
+        </w:rPr>
+        <w:t>95.9%</w:t>
+      </w:r>
+      <w:r>
+        <w:t xml:space="preserve">. </w:t>
+      </w:r>
+      <w:r>
+        <w:rPr>
+          <w:rFonts w:hint="eastAsia"/>
+        </w:rPr>
+        <w:t>and</w:t>
+      </w:r>
+      <w:r>
+        <w:t xml:space="preserve"> when new penguins are added in the future, </w:t>
+      </w:r>
+      <w:r>
+        <w:rPr>
+          <w:rFonts w:hint="eastAsia"/>
+        </w:rPr>
+        <w:t xml:space="preserve">we can just add </w:t>
+      </w:r>
+      <w:r>
+        <w:t>their features database without retrain the model.</w:t>
+      </w:r>
+      <w:r>
+        <w:rPr>
+          <w:rFonts w:hint="eastAsia"/>
+        </w:rPr>
+        <w:t xml:space="preserve"> </w:t>
+      </w:r>
+      <w:r>
+        <w:t xml:space="preserve">The system can also reject uncertain identifications. For example, if a visitor’s photo is too </w:t>
+      </w:r>
+      <w:r>
+        <w:rPr>
+          <w:rFonts w:hint="eastAsia"/>
+        </w:rPr>
+        <w:t>far from penguins</w:t>
+      </w:r>
+      <w:r>
+        <w:t>, the system can prompt them to take another photo.</w:t>
+      </w:r>
+    </w:p>
+    <w:p/>
+    <w:p>
+      <w:r>
+        <w:rPr>
+          <w:rFonts w:hint="eastAsia"/>
+        </w:rPr>
+        <w:t>我构建了一个向量数据库，用resnet18提取的特征，</w:t>
+      </w:r>
+      <w:proofErr w:type="gramStart"/>
+      <w:r>
+        <w:rPr>
+          <w:rFonts w:hint="eastAsia"/>
+        </w:rPr>
+        <w:t>然后目前</w:t>
+      </w:r>
+      <w:proofErr w:type="gramEnd"/>
+      <w:r>
+        <w:rPr>
+          <w:rFonts w:hint="eastAsia"/>
+        </w:rPr>
+        <w:t>的准确率达到了95.9%，然后现在</w:t>
+      </w:r>
+      <w:proofErr w:type="gramStart"/>
+      <w:r>
+        <w:rPr>
+          <w:rFonts w:hint="eastAsia"/>
+        </w:rPr>
+        <w:t>在</w:t>
+      </w:r>
+      <w:proofErr w:type="gramEnd"/>
+      <w:r>
+        <w:rPr>
+          <w:rFonts w:hint="eastAsia"/>
+        </w:rPr>
+        <w:t>后面有新的企鹅加入的时候就可以直接</w:t>
+      </w:r>
+      <w:proofErr w:type="gramStart"/>
+      <w:r>
+        <w:rPr>
+          <w:rFonts w:hint="eastAsia"/>
+        </w:rPr>
+        <w:t>把特征</w:t>
+      </w:r>
+      <w:proofErr w:type="gramEnd"/>
+      <w:r>
+        <w:rPr>
+          <w:rFonts w:hint="eastAsia"/>
+        </w:rPr>
+        <w:t>存进向量库就行，不用重新训练，然后还可以拒绝识别，比如游客拍照太模糊可以提升重新拍摄</w:t>
+      </w:r>
+    </w:p>
+    <w:p/>
+    <w:p>
+      <w:r>
+        <w:t>I also tried data augmentation, but it did not lead to much improvement</w:t>
+      </w:r>
+      <w:r>
+        <w:rPr>
+          <w:rFonts w:hint="eastAsia"/>
+        </w:rPr>
+        <w:t xml:space="preserve"> on the recognize accuracy</w:t>
+      </w:r>
+      <w:r>
+        <w:t xml:space="preserve">. I think this may be because during the training stage, the model had already used </w:t>
+      </w:r>
+      <w:r>
+        <w:rPr>
+          <w:rFonts w:hint="eastAsia"/>
+        </w:rPr>
+        <w:t>something like</w:t>
+      </w:r>
+      <w:r>
+        <w:t xml:space="preserve"> random horizontal flipping</w:t>
+      </w:r>
+      <w:r>
+        <w:rPr>
+          <w:rFonts w:hint="eastAsia"/>
+        </w:rPr>
+        <w:t xml:space="preserve">, </w:t>
+      </w:r>
+      <w:r>
+        <w:t xml:space="preserve">so </w:t>
+      </w:r>
+      <w:r>
+        <w:rPr>
+          <w:rFonts w:hint="eastAsia"/>
+        </w:rPr>
+        <w:t xml:space="preserve">it </w:t>
+      </w:r>
+      <w:r>
+        <w:t>did not provide much additional information gain.</w:t>
+      </w:r>
+    </w:p>
+    <w:p>
+      <w:r>
+        <w:rPr>
+          <w:rFonts w:hint="eastAsia"/>
+        </w:rPr>
+        <w:t>然后我尝试了数据增强，没有什么提升，我认为可能是因为</w:t>
+      </w:r>
+      <w:r>
+        <w:t>模型在训练阶段已使用了随机水平翻转等增强手段，因此在测试阶段再施加同类增强难以带来新的信息增益。</w:t>
+      </w:r>
+    </w:p>
+    <w:p/>
+    <w:p>
+      <w:pPr>
+        <w:rPr>
+          <w:rFonts w:hint="eastAsia"/>
+        </w:rPr>
+      </w:pPr>
+      <w:r>
+        <w:t xml:space="preserve">For the next step, I </w:t>
+      </w:r>
+      <w:r>
+        <w:rPr>
+          <w:rFonts w:hint="eastAsia"/>
+        </w:rPr>
+        <w:t>plan</w:t>
+      </w:r>
+      <w:r>
+        <w:t xml:space="preserve"> to build a clean and well-structured penguin profile database, including </w:t>
+      </w:r>
+      <w:r>
+        <w:rPr>
+          <w:rFonts w:hint="eastAsia"/>
+        </w:rPr>
+        <w:t xml:space="preserve">such as </w:t>
+      </w:r>
+      <w:r>
+        <w:t xml:space="preserve">penguin’s name, date of birth, personality, physical features, </w:t>
+      </w:r>
+      <w:proofErr w:type="spellStart"/>
+      <w:r>
+        <w:t>behavioural</w:t>
+      </w:r>
+      <w:proofErr w:type="spellEnd"/>
+      <w:r>
+        <w:t xml:space="preserve"> habits, and other relevant information. </w:t>
+      </w:r>
+      <w:r>
+        <w:t>A</w:t>
+      </w:r>
+      <w:r>
+        <w:rPr>
+          <w:rFonts w:hint="eastAsia"/>
+        </w:rPr>
+        <w:t>s the knowledge database of the system.</w:t>
+      </w:r>
+    </w:p>
+    <w:p>
+      <w:r>
+        <w:t>后续我</w:t>
+      </w:r>
+      <w:r>
+        <w:rPr>
+          <w:rFonts w:hint="eastAsia"/>
+        </w:rPr>
+        <w:t>需要建立</w:t>
+      </w:r>
+      <w:r>
+        <w:t>一个整洁的企鹅信息档案库，包含每只企鹅的姓名、出生日期、性格、外形特征、生活习性等信息，</w:t>
+      </w:r>
+      <w:r>
+        <w:t xml:space="preserve"> </w:t>
+      </w:r>
+    </w:p>
+    <w:p/>
+    <w:p/>
+    <w:p/>
+    <w:p/>
+    <w:p/>
+    <w:p>
+      <w:pPr>
+        <w:rPr>
+          <w:rFonts w:hint="eastAsia"/>
+        </w:rPr>
+      </w:pPr>
+    </w:p>
     <w:sectPr>
       <w:pgSz w:w="11906" w:h="16838"/>
       <w:pgMar w:top="1440" w:right="1800" w:bottom="1440" w:left="1800" w:header="851" w:footer="992" w:gutter="0"/>
@@ -269,6 +852,56 @@
     </w:sectPr>
   </w:body>
 </w:document>
+</file>
+
+<file path=word/endnotes.xml><?xml version="1.0" encoding="utf-8"?>
+<w:endnotes xmlns:wpc="http://schemas.microsoft.com/office/word/2010/wordprocessingCanvas" xmlns:cx="http://schemas.microsoft.com/office/drawing/2014/chartex" xmlns:cx1="http://schemas.microsoft.com/office/drawing/2015/9/8/chartex" xmlns:cx2="http://schemas.microsoft.com/office/drawing/2015/10/21/chartex" xmlns:cx3="http://schemas.microsoft.com/office/drawing/2016/5/9/chartex" xmlns:cx4="http://schemas.microsoft.com/office/drawing/2016/5/10/chartex" xmlns:cx5="http://schemas.microsoft.com/office/drawing/2016/5/11/chartex" xmlns:cx6="http://schemas.microsoft.com/office/drawing/2016/5/12/chartex" xmlns:cx7="http://schemas.microsoft.com/office/drawing/2016/5/13/chartex" xmlns:cx8="http://schemas.microsoft.com/office/drawing/2016/5/14/chartex" xmlns:mc="http://schemas.openxmlformats.org/markup-compatibility/2006" xmlns:aink="http://schemas.microsoft.com/office/drawing/2016/ink" xmlns:am3d="http://schemas.microsoft.com/office/drawing/2017/model3d" xmlns:o="urn:schemas-microsoft-com:office:office" xmlns:oel="http://schemas.microsoft.com/office/2019/extlst" xmlns:r="http://schemas.openxmlformats.org/officeDocument/2006/relationships" xmlns:m="http://schemas.openxmlformats.org/officeDocument/2006/math" xmlns:v="urn:schemas-microsoft-com:vml" xmlns:wp14="http://schemas.microsoft.com/office/word/2010/wordprocessingDrawing" xmlns:wp="http://schemas.openxmlformats.org/drawingml/2006/wordprocessingDrawing" xmlns:w10="urn:schemas-microsoft-com:office:word" xmlns:w="http://schemas.openxmlformats.org/wordprocessingml/2006/main" xmlns:w14="http://schemas.microsoft.com/office/word/2010/wordml" xmlns:w15="http://schemas.microsoft.com/office/word/2012/wordml" xmlns:w16cex="http://schemas.microsoft.com/office/word/2018/wordml/cex" xmlns:w16cid="http://schemas.microsoft.com/office/word/2016/wordml/cid" xmlns:w16="http://schemas.microsoft.com/office/word/2018/wordml" xmlns:w16du="http://schemas.microsoft.com/office/word/2023/wordml/word16du" xmlns:w16sdtdh="http://schemas.microsoft.com/office/word/2020/wordml/sdtdatahash" xmlns:w16sdtfl="http://schemas.microsoft.com/office/word/2024/wordml/sdtformatlock" xmlns:w16se="http://schemas.microsoft.com/office/word/2015/wordml/symex" xmlns:wpg="http://schemas.microsoft.com/office/word/2010/wordprocessingGroup" xmlns:wpi="http://schemas.microsoft.com/office/word/2010/wordprocessingInk" xmlns:wne="http://schemas.microsoft.com/office/word/2006/wordml" xmlns:wps="http://schemas.microsoft.com/office/word/2010/wordprocessingShape" mc:Ignorable="w14 w15 w16se w16cid w16 w16cex w16sdtdh w16sdtfl w16du wp14">
+  <w:endnote w:type="separator" w:id="-1">
+    <w:p>
+      <w:pPr>
+        <w:spacing w:after="0" w:line="240" w:lineRule="auto"/>
+      </w:pPr>
+      <w:r>
+        <w:separator/>
+      </w:r>
+    </w:p>
+  </w:endnote>
+  <w:endnote w:type="continuationSeparator" w:id="0">
+    <w:p>
+      <w:pPr>
+        <w:spacing w:after="0" w:line="240" w:lineRule="auto"/>
+      </w:pPr>
+      <w:r>
+        <w:continuationSeparator/>
+      </w:r>
+    </w:p>
+  </w:endnote>
+</w:endnotes>
+</file>
+
+<file path=word/footnotes.xml><?xml version="1.0" encoding="utf-8"?>
+<w:footnotes xmlns:wpc="http://schemas.microsoft.com/office/word/2010/wordprocessingCanvas" xmlns:cx="http://schemas.microsoft.com/office/drawing/2014/chartex" xmlns:cx1="http://schemas.microsoft.com/office/drawing/2015/9/8/chartex" xmlns:cx2="http://schemas.microsoft.com/office/drawing/2015/10/21/chartex" xmlns:cx3="http://schemas.microsoft.com/office/drawing/2016/5/9/chartex" xmlns:cx4="http://schemas.microsoft.com/office/drawing/2016/5/10/chartex" xmlns:cx5="http://schemas.microsoft.com/office/drawing/2016/5/11/chartex" xmlns:cx6="http://schemas.microsoft.com/office/drawing/2016/5/12/chartex" xmlns:cx7="http://schemas.microsoft.com/office/drawing/2016/5/13/chartex" xmlns:cx8="http://schemas.microsoft.com/office/drawing/2016/5/14/chartex" xmlns:mc="http://schemas.openxmlformats.org/markup-compatibility/2006" xmlns:aink="http://schemas.microsoft.com/office/drawing/2016/ink" xmlns:am3d="http://schemas.microsoft.com/office/drawing/2017/model3d" xmlns:o="urn:schemas-microsoft-com:office:office" xmlns:oel="http://schemas.microsoft.com/office/2019/extlst" xmlns:r="http://schemas.openxmlformats.org/officeDocument/2006/relationships" xmlns:m="http://schemas.openxmlformats.org/officeDocument/2006/math" xmlns:v="urn:schemas-microsoft-com:vml" xmlns:wp14="http://schemas.microsoft.com/office/word/2010/wordprocessingDrawing" xmlns:wp="http://schemas.openxmlformats.org/drawingml/2006/wordprocessingDrawing" xmlns:w10="urn:schemas-microsoft-com:office:word" xmlns:w="http://schemas.openxmlformats.org/wordprocessingml/2006/main" xmlns:w14="http://schemas.microsoft.com/office/word/2010/wordml" xmlns:w15="http://schemas.microsoft.com/office/word/2012/wordml" xmlns:w16cex="http://schemas.microsoft.com/office/word/2018/wordml/cex" xmlns:w16cid="http://schemas.microsoft.com/office/word/2016/wordml/cid" xmlns:w16="http://schemas.microsoft.com/office/word/2018/wordml" xmlns:w16du="http://schemas.microsoft.com/office/word/2023/wordml/word16du" xmlns:w16sdtdh="http://schemas.microsoft.com/office/word/2020/wordml/sdtdatahash" xmlns:w16sdtfl="http://schemas.microsoft.com/office/word/2024/wordml/sdtformatlock" xmlns:w16se="http://schemas.microsoft.com/office/word/2015/wordml/symex" xmlns:wpg="http://schemas.microsoft.com/office/word/2010/wordprocessingGroup" xmlns:wpi="http://schemas.microsoft.com/office/word/2010/wordprocessingInk" xmlns:wne="http://schemas.microsoft.com/office/word/2006/wordml" xmlns:wps="http://schemas.microsoft.com/office/word/2010/wordprocessingShape" mc:Ignorable="w14 w15 w16se w16cid w16 w16cex w16sdtdh w16sdtfl w16du wp14">
+  <w:footnote w:type="separator" w:id="-1">
+    <w:p>
+      <w:pPr>
+        <w:spacing w:after="0" w:line="240" w:lineRule="auto"/>
+      </w:pPr>
+      <w:r>
+        <w:separator/>
+      </w:r>
+    </w:p>
+  </w:footnote>
+  <w:footnote w:type="continuationSeparator" w:id="0">
+    <w:p>
+      <w:pPr>
+        <w:spacing w:after="0" w:line="240" w:lineRule="auto"/>
+      </w:pPr>
+      <w:r>
+        <w:continuationSeparator/>
+      </w:r>
+    </w:p>
+  </w:footnote>
+</w:footnotes>
 </file>
 
 <file path=word/styles.xml><?xml version="1.0" encoding="utf-8"?>
@@ -878,7 +1511,6 @@
   <w:style w:type="character" w:default="1" w:styleId="a0">
     <w:name w:val="Default Paragraph Font"/>
     <w:uiPriority w:val="1"/>
-    <w:semiHidden/>
     <w:unhideWhenUsed/>
   </w:style>
   <w:style w:type="table" w:default="1" w:styleId="a1">
@@ -1193,6 +1825,69 @@
       <w:smallCaps/>
       <w:color w:val="2F5496" w:themeColor="accent1" w:themeShade="BF"/>
       <w:spacing w:val="5"/>
+    </w:rPr>
+  </w:style>
+  <w:style w:type="paragraph" w:styleId="ae">
+    <w:name w:val="header"/>
+    <w:basedOn w:val="a"/>
+    <w:link w:val="af"/>
+    <w:uiPriority w:val="99"/>
+    <w:unhideWhenUsed/>
+    <w:rsid w:val="00E57836"/>
+    <w:pPr>
+      <w:tabs>
+        <w:tab w:val="center" w:pos="4153"/>
+        <w:tab w:val="right" w:pos="8306"/>
+      </w:tabs>
+      <w:snapToGrid w:val="0"/>
+      <w:spacing w:line="240" w:lineRule="auto"/>
+      <w:jc w:val="center"/>
+    </w:pPr>
+    <w:rPr>
+      <w:sz w:val="18"/>
+      <w:szCs w:val="18"/>
+    </w:rPr>
+  </w:style>
+  <w:style w:type="character" w:customStyle="1" w:styleId="af">
+    <w:name w:val="页眉 字符"/>
+    <w:basedOn w:val="a0"/>
+    <w:link w:val="ae"/>
+    <w:uiPriority w:val="99"/>
+    <w:rsid w:val="00E57836"/>
+    <w:rPr>
+      <w:sz w:val="18"/>
+      <w:szCs w:val="18"/>
+    </w:rPr>
+  </w:style>
+  <w:style w:type="paragraph" w:styleId="af0">
+    <w:name w:val="footer"/>
+    <w:basedOn w:val="a"/>
+    <w:link w:val="af1"/>
+    <w:uiPriority w:val="99"/>
+    <w:unhideWhenUsed/>
+    <w:rsid w:val="00E57836"/>
+    <w:pPr>
+      <w:tabs>
+        <w:tab w:val="center" w:pos="4153"/>
+        <w:tab w:val="right" w:pos="8306"/>
+      </w:tabs>
+      <w:snapToGrid w:val="0"/>
+      <w:spacing w:line="240" w:lineRule="auto"/>
+    </w:pPr>
+    <w:rPr>
+      <w:sz w:val="18"/>
+      <w:szCs w:val="18"/>
+    </w:rPr>
+  </w:style>
+  <w:style w:type="character" w:customStyle="1" w:styleId="af1">
+    <w:name w:val="页脚 字符"/>
+    <w:basedOn w:val="a0"/>
+    <w:link w:val="af0"/>
+    <w:uiPriority w:val="99"/>
+    <w:rsid w:val="00E57836"/>
+    <w:rPr>
+      <w:sz w:val="18"/>
+      <w:szCs w:val="18"/>
     </w:rPr>
   </w:style>
 </w:styles>

</xml_diff>